<commit_message>
Tambah paket praktikum 3 dan selaraskan pemulihan P4 dengan modul P3
- praktikum-03: cek awal, pemulihan P2, cek mandiri, dan revisi modul 75 menit
- P04_pulihkan_p3: struktur customers (email NULL, created_at DATE) dan data
  pelanggan mengikuti P3; indeks unik sku ditambahkan jika belum ada
- P04_cek_awal: periksa indeks unik sku dan struktur customers

Co-Authored-By: Claude Opus 5.5 <noreply@anthropic.com>
Claude-Session: https://claude.ai/code/session_01Cyj1LcpJihtdkUGg8rmXh8
</commit_message>
<xml_diff>
--- a/praktikum-04/revisi-modul-p04.docx
+++ b/praktikum-04/revisi-modul-p04.docx
@@ -505,19 +505,16 @@
         <w:pStyle w:val="Compact"/>
       </w:pPr>
       <w:r>
-        <w:t xml:space="preserve">Pada</w:t>
-      </w:r>
-      <w:r>
-        <w:t xml:space="preserve"> </w:t>
-      </w:r>
-      <w:r>
         <w:rPr>
           <w:rStyle w:val="VerbatimChar"/>
         </w:rPr>
         <w:t xml:space="preserve">P04_pulihkan_p3.sql</w:t>
       </w:r>
       <w:r>
-        <w:t xml:space="preserve">, sesuaikan nama produk, harga, panjang</w:t>
+        <w:t xml:space="preserve"> </w:t>
+      </w:r>
+      <w:r>
+        <w:t xml:space="preserve">sudah mengikuti modul praktikum 3: struktur</w:t>
       </w:r>
       <w:r>
         <w:t xml:space="preserve"> </w:t>
@@ -526,10 +523,13 @@
         <w:rPr>
           <w:rStyle w:val="VerbatimChar"/>
         </w:rPr>
-        <w:t xml:space="preserve">VARCHAR</w:t>
-      </w:r>
-      <w:r>
-        <w:t xml:space="preserve">, tipe</w:t>
+        <w:t xml:space="preserve">products</w:t>
+      </w:r>
+      <w:r>
+        <w:t xml:space="preserve"> </w:t>
+      </w:r>
+      <w:r>
+        <w:t xml:space="preserve">dan</w:t>
       </w:r>
       <w:r>
         <w:t xml:space="preserve"> </w:t>
@@ -538,23 +538,10 @@
         <w:rPr>
           <w:rStyle w:val="VerbatimChar"/>
         </w:rPr>
-        <w:t xml:space="preserve">stock_qty</w:t>
-      </w:r>
-      <w:r>
-        <w:t xml:space="preserve">, dan data pelanggan dengan</w:t>
-      </w:r>
-      <w:r>
-        <w:t xml:space="preserve"> </w:t>
-      </w:r>
-      <w:r>
-        <w:rPr>
-          <w:bCs/>
-          <w:b/>
-        </w:rPr>
-        <w:t xml:space="preserve">modul praktikum 3</w:t>
-      </w:r>
-      <w:r>
-        <w:t xml:space="preserve">. Nilai yang ada sekarang disusun dari isi modul praktikum 4 saja (kategori 1 Minuman dan 2 Roti, produk P01–P03 dengan stok 20, 15, 30, tiga pelanggan</w:t>
+        <w:t xml:space="preserve">customers</w:t>
+      </w:r>
+      <w:r>
+        <w:t xml:space="preserve">, tiga pelanggan Rani, Bima (email</w:t>
       </w:r>
       <w:r>
         <w:t xml:space="preserve"> </w:t>
@@ -563,10 +550,97 @@
         <w:rPr>
           <w:rStyle w:val="VerbatimChar"/>
         </w:rPr>
-        <w:t xml:space="preserve">example.com</w:t>
-      </w:r>
-      <w:r>
-        <w:t xml:space="preserve">).</w:t>
+        <w:t xml:space="preserve">NULL</w:t>
+      </w:r>
+      <w:r>
+        <w:t xml:space="preserve">), dan Nisa, serta indeks unik</w:t>
+      </w:r>
+      <w:r>
+        <w:t xml:space="preserve"> </w:t>
+      </w:r>
+      <w:r>
+        <w:rPr>
+          <w:rStyle w:val="VerbatimChar"/>
+        </w:rPr>
+        <w:t xml:space="preserve">sku</w:t>
+      </w:r>
+      <w:r>
+        <w:t xml:space="preserve">. Indeks unik hanya ditambahkan jika belum ada dan tidak ada SKU ganda. Yang masih berupa contoh adalah panjang</w:t>
+      </w:r>
+      <w:r>
+        <w:t xml:space="preserve"> </w:t>
+      </w:r>
+      <w:r>
+        <w:rPr>
+          <w:rStyle w:val="VerbatimChar"/>
+        </w:rPr>
+        <w:t xml:space="preserve">category_name</w:t>
+      </w:r>
+      <w:r>
+        <w:t xml:space="preserve">, nama produk, dan harga P01–P03, karena ketiganya berasal dari praktikum 2. Baris tersebut ditandai</w:t>
+      </w:r>
+      <w:r>
+        <w:t xml:space="preserve"> </w:t>
+      </w:r>
+      <w:r>
+        <w:rPr>
+          <w:rStyle w:val="VerbatimChar"/>
+        </w:rPr>
+        <w:t xml:space="preserve">SESUAIKAN P2</w:t>
+      </w:r>
+      <w:r>
+        <w:t xml:space="preserve">.</w:t>
+      </w:r>
+    </w:p>
+    <w:p>
+      <w:pPr>
+        <w:numPr>
+          <w:ilvl w:val="0"/>
+          <w:numId w:val="1002"/>
+        </w:numPr>
+        <w:pStyle w:val="Compact"/>
+      </w:pPr>
+      <w:r>
+        <w:rPr>
+          <w:rStyle w:val="VerbatimChar"/>
+        </w:rPr>
+        <w:t xml:space="preserve">P04_cek_awal.sql</w:t>
+      </w:r>
+      <w:r>
+        <w:t xml:space="preserve"> </w:t>
+      </w:r>
+      <w:r>
+        <w:t xml:space="preserve">juga memeriksa indeks unik</w:t>
+      </w:r>
+      <w:r>
+        <w:t xml:space="preserve"> </w:t>
+      </w:r>
+      <w:r>
+        <w:rPr>
+          <w:rStyle w:val="VerbatimChar"/>
+        </w:rPr>
+        <w:t xml:space="preserve">sku</w:t>
+      </w:r>
+      <w:r>
+        <w:t xml:space="preserve"> </w:t>
+      </w:r>
+      <w:r>
+        <w:t xml:space="preserve">dan struktur</w:t>
+      </w:r>
+      <w:r>
+        <w:t xml:space="preserve"> </w:t>
+      </w:r>
+      <w:r>
+        <w:rPr>
+          <w:rStyle w:val="VerbatimChar"/>
+        </w:rPr>
+        <w:t xml:space="preserve">customers</w:t>
+      </w:r>
+      <w:r>
+        <w:t xml:space="preserve"> </w:t>
+      </w:r>
+      <w:r>
+        <w:t xml:space="preserve">dari praktikum 3.</w:t>
       </w:r>
     </w:p>
     <w:p>

</xml_diff>